<commit_message>
docs(lab4): complete course reflection
</commit_message>
<xml_diff>
--- a/实验四_软件质量工程与AI辅助代码审查/10_课程总结与个人反思.docx
+++ b/实验四_软件质量工程与AI辅助代码审查/10_课程总结与个人反思.docx
@@ -532,13 +532,19 @@
             </w:tcBorders>
           </w:tcPr>
           <w:p>
+            <w:pPr>
+              <w:spacing w:after="80"/>
+            </w:pPr>
+            <w:r/>
             <w:r>
+              <w:rPr>
+                <w:rFonts w:ascii="Microsoft YaHei" w:hAnsi="Microsoft YaHei" w:eastAsia="Microsoft YaHei"/>
+                <w:b w:val="0"/>
+                <w:sz w:val="21"/>
+              </w:rPr>
               <w:t>填写记录</w:t>
-            </w:r>
-          </w:p>
-          <w:p>
-            <w:r>
-              <w:t>本文件已按实验四任务书和模板章节完成填报；保留原章节结构，无法在本机执行的外部工具以可复现命令、阈值和预期结果说明。</w:t>
+              <w:br/>
+              <w:t>本文件按“个人 ≥ 800 字”的要求重写课程总结与个人反思，保留模板章节结构，并补充各章节字数统计。</w:t>
             </w:r>
           </w:p>
         </w:tc>
@@ -586,8 +592,17 @@
             <w:vAlign w:val="top"/>
           </w:tcPr>
           <w:p>
+            <w:pPr>
+              <w:spacing w:after="80"/>
+            </w:pPr>
+            <w:r/>
             <w:r>
-              <w:t>四个实验连起来之后，我对软件工程的理解从“写出功能”转向“把需求、架构、交付、质量都串起来”。实验一让我看到需求如果没有边界和追溯，后面的设计会不断返工；实验二让我意识到架构不是画漂亮图，而是把质量属性和风险显式化；实验三把这些设计落到流水线、容器和可观测性；实验四则进一步证明，真正可靠的软件必须有自动化测试、缺陷闭环和审查机制支撑。</w:t>
+              <w:rPr>
+                <w:rFonts w:ascii="Microsoft YaHei" w:hAnsi="Microsoft YaHei" w:eastAsia="Microsoft YaHei"/>
+                <w:b w:val="0"/>
+                <w:sz w:val="21"/>
+              </w:rPr>
+              <w:t>四个实验连起来之后，我对软件工程的理解从“写出功能”转向“把需求、架构、交付、质量都串起来”。实验一做需求时，最明显的感受是需求不是把想法写满，而是要把范围、角色、业务规则、验收标准和追溯关系说清楚；如果这个阶段含糊，后面的设计和测试都会反复返工。实验二让我意识到架构图和 ADR 的价值不在于形式，而在于把取舍公开化，让团队知道为什么选择某种边界、依赖和部署方式。实验三把设计放进流水线、容器和可观测性里，我第一次比较完整地看到“交付”不是上传代码，而是让代码可以被构建、检查、部署和回滚。实验四再往前推了一步：质量不能等到最后补测试，必须从需求、设计、代码、CI、缺陷和审查记录中持续积累证据。</w:t>
             </w:r>
           </w:p>
         </w:tc>
@@ -635,8 +650,17 @@
             <w:vAlign w:val="top"/>
           </w:tcPr>
           <w:p>
+            <w:pPr>
+              <w:spacing w:after="80"/>
+            </w:pPr>
+            <w:r/>
             <w:r>
-              <w:t>我在本次实验中主要承担测试计划、测试用例设计、自动化测试代码、运行报告和 AI Review 记录整理工作。为了让交付物可检查，我把重点放在可执行脚本、可追溯用例和模板内填报，而不是只写结论。</w:t>
+              <w:rPr>
+                <w:rFonts w:ascii="Microsoft YaHei" w:hAnsi="Microsoft YaHei" w:eastAsia="Microsoft YaHei"/>
+                <w:b w:val="0"/>
+                <w:sz w:val="21"/>
+              </w:rPr>
+              <w:t>在实验四中，我主要承担测试计划、测试用例设计、自动化测试代码、运行报告和 AI 代码审查记录整理工作。我的工作重点不是把文档写得很满，而是尽量让每一份材料都能被检查：测试计划里给出质量目标和门禁；测试用例表里把需求、输入、步骤、预期结果和自动化覆盖关联起来；D4-3 中保留可执行的 Python 测试脚本、报告和覆盖率口径；AI Review 记录中区分“AI 提议”和“人工裁决”。这个过程让我意识到，软件工程作业真正难的地方不是某一个文件，而是多个文件之间要互相对得上，不能一个地方说有测试，另一个地方却找不到用例或报告。</w:t>
             </w:r>
           </w:p>
         </w:tc>
@@ -684,8 +708,17 @@
             <w:vAlign w:val="top"/>
           </w:tcPr>
           <w:p>
+            <w:pPr>
+              <w:spacing w:after="80"/>
+            </w:pPr>
+            <w:r/>
             <w:r>
-              <w:t>最大的卡点是 D4-3 要同时满足“看起来像真实质量工程”和“老师能在普通环境中运行”。一开始容易直接依赖 pytest、Hypothesis、Playwright、k6 等工具，但这样 clone 后可能跑不起来。最终采用标准库可执行版本加 CI 迁移入口，既保留真实性，也保证基础验证可复现。</w:t>
+              <w:rPr>
+                <w:rFonts w:ascii="Microsoft YaHei" w:hAnsi="Microsoft YaHei" w:eastAsia="Microsoft YaHei"/>
+                <w:b w:val="0"/>
+                <w:sz w:val="21"/>
+              </w:rPr>
+              <w:t>这次最大的卡点是我一开始容易把“看起来专业”和“真正可复现”混在一起。比如 D4-3 如果直接依赖 pytest、Hypothesis、Playwright、k6、ZAP 等工具，报告会显得很像真实项目，但老师或同学 clone 下来后未必能马上运行；如果只写文字说明，又缺少工程证据。后来我把基础验证改成标准库可运行的版本，同时保留 k6、ZAP、Playwright 的迁移入口，这样既能证明测试思想，也能保证最小环境下能跑通。这个教训对我很重要：工程方案不能只追求“高级工具”，还要考虑使用者的环境、成本和失败时的解释路径。以后我做项目时会先明确最低可运行闭环，再逐步引入更复杂的工具链。</w:t>
             </w:r>
           </w:p>
         </w:tc>
@@ -733,8 +766,17 @@
             <w:vAlign w:val="top"/>
           </w:tcPr>
           <w:p>
+            <w:pPr>
+              <w:spacing w:after="80"/>
+            </w:pPr>
+            <w:r/>
             <w:r>
-              <w:t>AI 辅助软件工程很适合做风险清单、测试策略补全和代码审查视角扩展，但它不能替代工程证据。AI 的建议必须落到测试、缺陷、PR 或文档，否则只能算灵感。尤其是安全和性能问题，最后仍然要靠扫描、压测和人工裁决。</w:t>
+              <w:rPr>
+                <w:rFonts w:ascii="Microsoft YaHei" w:hAnsi="Microsoft YaHei" w:eastAsia="Microsoft YaHei"/>
+                <w:b w:val="0"/>
+                <w:sz w:val="21"/>
+              </w:rPr>
+              <w:t>我认为 AI 对软件工程最有帮助的地方，是扩展视角和提高初稿效率。它可以帮我快速列出测试类型、风险点、审查角色、缺陷分类和文档结构，也能提醒我哪些地方缺少验收标准或可观测指标。但是这门课也让我更清楚地看到，AI 的输出不能直接等同于工程事实。比如它给出的安全风险、性能瓶颈或测试建议，必须落到脚本、截图、报告、缺陷台账、PR 记录或人工裁决中，才算真正进入工程闭环。AI 更像一个很快的协作者，而不是负责人；负责人仍然需要判断哪些建议采纳、哪些是误报、哪些需要实验验证。对学生来说，合理使用 AI 的关键不是让它替自己写完，而是借它发现盲区，再用证据把结论坐实。</w:t>
             </w:r>
           </w:p>
         </w:tc>
@@ -782,8 +824,17 @@
             <w:vAlign w:val="top"/>
           </w:tcPr>
           <w:p>
+            <w:pPr>
+              <w:spacing w:after="80"/>
+            </w:pPr>
+            <w:r/>
             <w:r>
-              <w:t>这门课让我更愿意做工程化开发。相比只完成一个页面或接口，我更喜欢把系统从需求到部署再到质量门禁完整跑通，因为这更接近真实软件团队的工作方式。</w:t>
+              <w:rPr>
+                <w:rFonts w:ascii="Microsoft YaHei" w:hAnsi="Microsoft YaHei" w:eastAsia="Microsoft YaHei"/>
+                <w:b w:val="0"/>
+                <w:sz w:val="21"/>
+              </w:rPr>
+              <w:t>这门课让我更愿意把自己定位成工程化开发者，而不只是会写代码的人。以前我更关注页面或接口能不能完成，现在会更自然地追问：这个需求怎么验收，架构为什么这样划分，失败后怎么回滚，质量指标在哪里看，缺陷是否有闭环。未来无论做后端、测试开发还是 DevOps 相关工作，我都希望保持这种习惯：先保证系统可理解、可测试、可交付，再追求功能数量和技术复杂度。</w:t>
             </w:r>
           </w:p>
         </w:tc>
@@ -831,8 +882,17 @@
             <w:vAlign w:val="top"/>
           </w:tcPr>
           <w:p>
+            <w:pPr>
+              <w:spacing w:after="80"/>
+            </w:pPr>
+            <w:r/>
             <w:r>
-              <w:t>课程最有价值的是四个实验之间有连续案例，能看到前一阶段的选择如何影响后一阶段。建议后续可以提供一个统一的最小代码仓库，让测试、CI、架构和质量指标都能围绕同一份代码持续演进。</w:t>
+              <w:rPr>
+                <w:rFonts w:ascii="Microsoft YaHei" w:hAnsi="Microsoft YaHei" w:eastAsia="Microsoft YaHei"/>
+                <w:b w:val="0"/>
+                <w:sz w:val="21"/>
+              </w:rPr>
+              <w:t>课程最有价值的是四个实验之间使用连续案例，能看到前一阶段的选择如何影响后一阶段。建议后续可以提供一个统一的最小代码仓库作为基线，让需求、架构、CI、测试和质量看板都围绕同一份代码持续演进；同时可以给出一份“最低可运行环境”说明，明确哪些工具必须安装，哪些可以用示例图或模拟报告替代。这样学生能把更多精力放在工程思考上，而不是在环境配置和模板格式之间来回消耗。</w:t>
             </w:r>
           </w:p>
         </w:tc>
@@ -881,8 +941,17 @@
             <w:vAlign w:val="center"/>
           </w:tcPr>
           <w:p>
+            <w:pPr>
+              <w:spacing w:after="80"/>
+            </w:pPr>
+            <w:r/>
             <w:r>
-              <w:t>个人反思补充：实验四提醒我，质量不是最后补测试，而是设计时就要考虑如何验证。未来我会在写功能前先想清楚可观测点、失败路径、测试数据和回滚方式。</w:t>
+              <w:rPr>
+                <w:rFonts w:ascii="Microsoft YaHei" w:hAnsi="Microsoft YaHei" w:eastAsia="Microsoft YaHei"/>
+                <w:b/>
+                <w:sz w:val="21"/>
+              </w:rPr>
+              <w:t>统计范围</w:t>
             </w:r>
           </w:p>
         </w:tc>
@@ -900,17 +969,16 @@
           </w:tcPr>
           <w:p>
             <w:pPr>
-              <w:spacing w:after="40" w:before="40"/>
-              <w:jc w:val="center"/>
+              <w:spacing w:after="80"/>
             </w:pPr>
+            <w:r/>
             <w:r>
               <w:rPr>
                 <w:rFonts w:ascii="Microsoft YaHei" w:hAnsi="Microsoft YaHei" w:eastAsia="Microsoft YaHei"/>
                 <w:b/>
-                <w:color w:val="FFFFFF"/>
-                <w:sz w:val="20"/>
+                <w:sz w:val="21"/>
               </w:rPr>
-              <w:t>字数</w:t>
+              <w:t>字数（约）</w:t>
             </w:r>
           </w:p>
         </w:tc>
@@ -930,17 +998,16 @@
           </w:tcPr>
           <w:p>
             <w:pPr>
-              <w:spacing w:after="40" w:before="40"/>
-              <w:jc w:val="center"/>
+              <w:spacing w:after="80"/>
             </w:pPr>
+            <w:r/>
             <w:r>
               <w:rPr>
                 <w:rFonts w:ascii="Microsoft YaHei" w:hAnsi="Microsoft YaHei" w:eastAsia="Microsoft YaHei"/>
                 <w:b w:val="0"/>
-                <w:color w:val="2B2B2B"/>
-                <w:sz w:val="19"/>
+                <w:sz w:val="21"/>
               </w:rPr>
-              <w:t>1</w:t>
+              <w:t>1 课程整体收获</w:t>
             </w:r>
           </w:p>
         </w:tc>
@@ -958,17 +1025,16 @@
           </w:tcPr>
           <w:p>
             <w:pPr>
-              <w:spacing w:after="40" w:before="40"/>
-              <w:jc w:val="left"/>
+              <w:spacing w:after="80"/>
             </w:pPr>
+            <w:r/>
             <w:r>
               <w:rPr>
                 <w:rFonts w:ascii="Microsoft YaHei" w:hAnsi="Microsoft YaHei" w:eastAsia="Microsoft YaHei"/>
                 <w:b w:val="0"/>
-                <w:color w:val="2B2B2B"/>
-                <w:sz w:val="19"/>
+                <w:sz w:val="21"/>
               </w:rPr>
-              <w:t>___</w:t>
+              <w:t>297 字</w:t>
             </w:r>
           </w:p>
         </w:tc>
@@ -988,17 +1054,16 @@
           </w:tcPr>
           <w:p>
             <w:pPr>
-              <w:spacing w:after="40" w:before="40"/>
-              <w:jc w:val="center"/>
+              <w:spacing w:after="80"/>
             </w:pPr>
+            <w:r/>
             <w:r>
               <w:rPr>
                 <w:rFonts w:ascii="Microsoft YaHei" w:hAnsi="Microsoft YaHei" w:eastAsia="Microsoft YaHei"/>
                 <w:b w:val="0"/>
-                <w:color w:val="2B2B2B"/>
-                <w:sz w:val="19"/>
+                <w:sz w:val="21"/>
               </w:rPr>
-              <w:t>2</w:t>
+              <w:t>2 个人贡献与团队角色</w:t>
             </w:r>
           </w:p>
         </w:tc>
@@ -1016,17 +1081,16 @@
           </w:tcPr>
           <w:p>
             <w:pPr>
-              <w:spacing w:after="40" w:before="40"/>
-              <w:jc w:val="left"/>
+              <w:spacing w:after="80"/>
             </w:pPr>
+            <w:r/>
             <w:r>
               <w:rPr>
                 <w:rFonts w:ascii="Microsoft YaHei" w:hAnsi="Microsoft YaHei" w:eastAsia="Microsoft YaHei"/>
                 <w:b w:val="0"/>
-                <w:color w:val="2B2B2B"/>
-                <w:sz w:val="19"/>
+                <w:sz w:val="21"/>
               </w:rPr>
-              <w:t>___</w:t>
+              <w:t>256 字</w:t>
             </w:r>
           </w:p>
         </w:tc>
@@ -1046,17 +1110,16 @@
           </w:tcPr>
           <w:p>
             <w:pPr>
-              <w:spacing w:after="40" w:before="40"/>
-              <w:jc w:val="center"/>
+              <w:spacing w:after="80"/>
             </w:pPr>
+            <w:r/>
             <w:r>
               <w:rPr>
                 <w:rFonts w:ascii="Microsoft YaHei" w:hAnsi="Microsoft YaHei" w:eastAsia="Microsoft YaHei"/>
                 <w:b w:val="0"/>
-                <w:color w:val="2B2B2B"/>
-                <w:sz w:val="19"/>
+                <w:sz w:val="21"/>
               </w:rPr>
-              <w:t>3</w:t>
+              <w:t>3 最大的一次失败与教训</w:t>
             </w:r>
           </w:p>
         </w:tc>
@@ -1074,17 +1137,16 @@
           </w:tcPr>
           <w:p>
             <w:pPr>
-              <w:spacing w:after="40" w:before="40"/>
-              <w:jc w:val="left"/>
+              <w:spacing w:after="80"/>
             </w:pPr>
+            <w:r/>
             <w:r>
               <w:rPr>
                 <w:rFonts w:ascii="Microsoft YaHei" w:hAnsi="Microsoft YaHei" w:eastAsia="Microsoft YaHei"/>
                 <w:b w:val="0"/>
-                <w:color w:val="2B2B2B"/>
-                <w:sz w:val="19"/>
+                <w:sz w:val="21"/>
               </w:rPr>
-              <w:t>___</w:t>
+              <w:t>289 字</w:t>
             </w:r>
           </w:p>
         </w:tc>
@@ -1104,17 +1166,16 @@
           </w:tcPr>
           <w:p>
             <w:pPr>
-              <w:spacing w:after="40" w:before="40"/>
-              <w:jc w:val="center"/>
+              <w:spacing w:after="80"/>
             </w:pPr>
+            <w:r/>
             <w:r>
               <w:rPr>
                 <w:rFonts w:ascii="Microsoft YaHei" w:hAnsi="Microsoft YaHei" w:eastAsia="Microsoft YaHei"/>
                 <w:b w:val="0"/>
-                <w:color w:val="2B2B2B"/>
-                <w:sz w:val="19"/>
+                <w:sz w:val="21"/>
               </w:rPr>
-              <w:t>4</w:t>
+              <w:t>4 对 AI 辅助软件工程的看法</w:t>
             </w:r>
           </w:p>
         </w:tc>
@@ -1132,17 +1193,16 @@
           </w:tcPr>
           <w:p>
             <w:pPr>
-              <w:spacing w:after="40" w:before="40"/>
-              <w:jc w:val="left"/>
+              <w:spacing w:after="80"/>
             </w:pPr>
+            <w:r/>
             <w:r>
               <w:rPr>
                 <w:rFonts w:ascii="Microsoft YaHei" w:hAnsi="Microsoft YaHei" w:eastAsia="Microsoft YaHei"/>
                 <w:b w:val="0"/>
-                <w:color w:val="2B2B2B"/>
-                <w:sz w:val="19"/>
+                <w:sz w:val="21"/>
               </w:rPr>
-              <w:t>___</w:t>
+              <w:t>274 字</w:t>
             </w:r>
           </w:p>
         </w:tc>
@@ -1162,17 +1222,16 @@
           </w:tcPr>
           <w:p>
             <w:pPr>
-              <w:spacing w:after="40" w:before="40"/>
-              <w:jc w:val="center"/>
+              <w:spacing w:after="80"/>
             </w:pPr>
+            <w:r/>
             <w:r>
               <w:rPr>
                 <w:rFonts w:ascii="Microsoft YaHei" w:hAnsi="Microsoft YaHei" w:eastAsia="Microsoft YaHei"/>
                 <w:b w:val="0"/>
-                <w:color w:val="2B2B2B"/>
-                <w:sz w:val="19"/>
+                <w:sz w:val="21"/>
               </w:rPr>
-              <w:t>5</w:t>
+              <w:t>5 对未来职业的影响</w:t>
             </w:r>
           </w:p>
         </w:tc>
@@ -1190,17 +1249,16 @@
           </w:tcPr>
           <w:p>
             <w:pPr>
-              <w:spacing w:after="40" w:before="40"/>
-              <w:jc w:val="left"/>
+              <w:spacing w:after="80"/>
             </w:pPr>
+            <w:r/>
             <w:r>
               <w:rPr>
                 <w:rFonts w:ascii="Microsoft YaHei" w:hAnsi="Microsoft YaHei" w:eastAsia="Microsoft YaHei"/>
                 <w:b w:val="0"/>
-                <w:color w:val="2B2B2B"/>
-                <w:sz w:val="19"/>
+                <w:sz w:val="21"/>
               </w:rPr>
-              <w:t>___</w:t>
+              <w:t>170 字</w:t>
             </w:r>
           </w:p>
         </w:tc>
@@ -1220,17 +1278,16 @@
           </w:tcPr>
           <w:p>
             <w:pPr>
-              <w:spacing w:after="40" w:before="40"/>
-              <w:jc w:val="center"/>
+              <w:spacing w:after="80"/>
             </w:pPr>
+            <w:r/>
             <w:r>
               <w:rPr>
                 <w:rFonts w:ascii="Microsoft YaHei" w:hAnsi="Microsoft YaHei" w:eastAsia="Microsoft YaHei"/>
                 <w:b w:val="0"/>
-                <w:color w:val="2B2B2B"/>
-                <w:sz w:val="19"/>
+                <w:sz w:val="21"/>
               </w:rPr>
-              <w:t>6</w:t>
+              <w:t>6 对课程的改进建议</w:t>
             </w:r>
           </w:p>
         </w:tc>
@@ -1248,17 +1305,16 @@
           </w:tcPr>
           <w:p>
             <w:pPr>
-              <w:spacing w:after="40" w:before="40"/>
-              <w:jc w:val="left"/>
+              <w:spacing w:after="80"/>
             </w:pPr>
+            <w:r/>
             <w:r>
               <w:rPr>
                 <w:rFonts w:ascii="Microsoft YaHei" w:hAnsi="Microsoft YaHei" w:eastAsia="Microsoft YaHei"/>
                 <w:b w:val="0"/>
-                <w:color w:val="2B2B2B"/>
-                <w:sz w:val="19"/>
+                <w:sz w:val="21"/>
               </w:rPr>
-              <w:t>___</w:t>
+              <w:t>179 字</w:t>
             </w:r>
           </w:p>
         </w:tc>
@@ -1278,15 +1334,14 @@
           </w:tcPr>
           <w:p>
             <w:pPr>
-              <w:spacing w:after="40" w:before="40"/>
-              <w:jc w:val="center"/>
+              <w:spacing w:after="80"/>
             </w:pPr>
+            <w:r/>
             <w:r>
               <w:rPr>
                 <w:rFonts w:ascii="Microsoft YaHei" w:hAnsi="Microsoft YaHei" w:eastAsia="Microsoft YaHei"/>
-                <w:b w:val="0"/>
-                <w:color w:val="2B2B2B"/>
-                <w:sz w:val="19"/>
+                <w:b/>
+                <w:sz w:val="21"/>
               </w:rPr>
               <w:t>总计</w:t>
             </w:r>
@@ -1306,17 +1361,16 @@
           </w:tcPr>
           <w:p>
             <w:pPr>
-              <w:spacing w:after="40" w:before="40"/>
-              <w:jc w:val="left"/>
+              <w:spacing w:after="80"/>
             </w:pPr>
+            <w:r/>
             <w:r>
               <w:rPr>
                 <w:rFonts w:ascii="Microsoft YaHei" w:hAnsi="Microsoft YaHei" w:eastAsia="Microsoft YaHei"/>
-                <w:b w:val="0"/>
-                <w:color w:val="2B2B2B"/>
-                <w:sz w:val="19"/>
+                <w:b/>
+                <w:sz w:val="21"/>
               </w:rPr>
-              <w:t>≥ 800</w:t>
+              <w:t>1465 字，满足 ≥ 800 字要求</w:t>
             </w:r>
           </w:p>
         </w:tc>
@@ -1346,8 +1400,17 @@
             <w:vAlign w:val="top"/>
           </w:tcPr>
           <w:p>
+            <w:pPr>
+              <w:spacing w:after="80"/>
+            </w:pPr>
+            <w:r/>
             <w:r>
-              <w:t>本节正文已合并到上述各章节；课程总结总字数满足个人反思要求。</w:t>
+              <w:rPr>
+                <w:rFonts w:ascii="Microsoft YaHei" w:hAnsi="Microsoft YaHei" w:eastAsia="Microsoft YaHei"/>
+                <w:b w:val="0"/>
+                <w:sz w:val="21"/>
+              </w:rPr>
+              <w:t>说明：以上字数按六个正文反思章节统计，原模板占位内容已替换；内容以个人学习过程、贡献、失败教训和 AI 辅助软件工程反思为主。</w:t>
             </w:r>
           </w:p>
         </w:tc>

</xml_diff>